<commit_message>
docs: add public release links to confirmatory evidence
</commit_message>
<xml_diff>
--- a/reports/HiddenBench确认性修订实验报告_2026-08-04.docx
+++ b/reports/HiddenBench确认性修订实验报告_2026-08-04.docx
@@ -7610,6 +7610,19 @@
         <w:t>项目仓库：https://github.com/sbw51898-beep/mas；固定分支：codex/budget-matched-dynamic；预定发布页：https://github.com/sbw51898-beep/mas/releases/tag/hiddenbench-confirmatory-20260804。</w:t>
       </w:r>
     </w:p>
+    <w:p>
+      <w:pPr>
+        <w:spacing w:after="120" w:line="300" w:lineRule="auto"/>
+      </w:pPr>
+      <w:r>
+        <w:rPr>
+          <w:rFonts w:ascii="Calibri" w:hAnsi="Calibri" w:eastAsia="Microsoft YaHei"/>
+          <w:b w:val="0"/>
+          <w:sz w:val="21"/>
+        </w:rPr>
+        <w:t>原始证据 ZIP：https://github.com/sbw51898-beep/mas/releases/download/hiddenbench-confirmatory-20260804/hiddenbench-confirmatory-20260804-raw.zip；对应 SHA-256 文件随 Release 同时发布。</w:t>
+      </w:r>
+    </w:p>
     <w:tbl>
       <w:tblPr>
         <w:tblStyle w:val="TableGrid"/>

</xml_diff>